<commit_message>
A1: Wire --dry/--live across CLI, enforce dry-run at write sites, lock signature; docs + tests
</commit_message>
<xml_diff>
--- a/user_guides/individual_programs/audio_normalizer/Audio_Normalizer_User_Guide.docx
+++ b/user_guides/individual_programs/audio_normalizer/Audio_Normalizer_User_Guide.docx
@@ -48,6 +48,66 @@
     <w:p>
       <w:r>
         <w:t>The processor discovers the shared Audio Suite audio extensions in the selected directory. The FFmpeg normalization path has configured codecs for MP3, FLAC, OGG, M4A, and Opus. Unsupported extensions are rejected rather than being silently written with the wrong codec.</w:t>
+      </w:r>
+    </w:p>
+    <w:p>
+      <w:pPr>
+        <w:pStyle w:val="Heading1"/>
+      </w:pPr>
+      <w:r>
+        <w:t>Why Only Five Formats Normalise</w:t>
+      </w:r>
+    </w:p>
+    <w:p>
+      <w:r>
+        <w:t>This is a deliberate design decision, not a gap. Normalisation re-encodes the audio stream, and the suite only configures an FFmpeg codec and quality setting for the five formats listed above. A file whose extension has no configured codec is therefore rejected with an unsupported-format error instead of being processed anyway.</w:t>
+      </w:r>
+    </w:p>
+    <w:p>
+      <w:r>
+        <w:t>The reason is that the alternative is silent data damage. Without a configured codec, the obvious fallback is to encode the audio as MP3 while keeping the original extension. That would leave a WAV container holding MP3 data, or an OGG file holding MP3 data: the library would still play, but the mislabelled codec would be discovered only later, by a player, a tagger, or a rip comparison. Rejecting the file keeps the library's format claims true, and reports the reason instead.</w:t>
+      </w:r>
+    </w:p>
+    <w:p>
+      <w:pPr>
+        <w:pStyle w:val="ListBullet"/>
+      </w:pPr>
+      <w:r>
+        <w:rPr>
+          <w:b/>
+        </w:rPr>
+        <w:t xml:space="preserve">What you see: </w:t>
+      </w:r>
+      <w:r>
+        <w:t>Each unsupported file is reported as an error naming its extension and listing the five supported formats. Other files in the same run continue; one unsupported file never aborts the batch.</w:t>
+      </w:r>
+    </w:p>
+    <w:p>
+      <w:pPr>
+        <w:pStyle w:val="ListBullet"/>
+      </w:pPr>
+      <w:r>
+        <w:rPr>
+          <w:b/>
+        </w:rPr>
+        <w:t xml:space="preserve">MP3 lossless mode: </w:t>
+      </w:r>
+      <w:r>
+        <w:t>The lossless mode adjusts the MP3 global_gain tag in place and does not re-encode, so it is not subject to this format set. A non-MP3 file falls back to the normalise path and is then subject to it.</w:t>
+      </w:r>
+    </w:p>
+    <w:p>
+      <w:pPr>
+        <w:pStyle w:val="ListBullet"/>
+      </w:pPr>
+      <w:r>
+        <w:rPr>
+          <w:b/>
+        </w:rPr>
+        <w:t xml:space="preserve">Adding a format: </w:t>
+      </w:r>
+      <w:r>
+        <w:t>Adding one means adding its codec and quality arguments to the normaliser's format table, so the guarantee is only as good as that table.</w:t>
       </w:r>
     </w:p>
     <w:p>

</xml_diff>